<commit_message>
Calibrar Non Template contra canon de Andrea/Aneira y corregir falso positivo real de grounding
- Non Template: modelo de spacing de 2 niveles (no tenia ningun `before`
  explicito), bullets con sangria colgante real + justificado, header sin
  years_experience (ningun canon de Non Template lo muestra). Verificado con
  candidata real (Yajaira Ortiz Ruiz) -- encontro y corrigio ademas un bug de
  spacing doble cuando skills/certifications quedan vacios (mismo bug latente
  sin corregir en New Format).
- grounding.py: GROUNDING_TOKEN_NOT_FOUND bloqueaba skills de una sola palabra
  pegadas a puntuacion sin espacio en la fuente (candidato real Luis Antonio
  Garcia Sanchez, New Format) -- tokenizacion pasada de .split() a split por
  regex. Test de regresion agregado.
- 75 tests + smoke test 6/6 en verde. Fixtures reales agregados a cvs-prueba/.

Co-Authored-By: Claude Sonnet 5 <noreply@anthropic.com>
</commit_message>
<xml_diff>
--- a/02-modulo2-agente-transformacion/microservicio/templates/anotados/Non Template Resume.docx
+++ b/02-modulo2-agente-transformacion/microservicio/templates/anotados/Non Template Resume.docx
@@ -4,9 +4,6 @@
   <w:body>
     <w:p>
       <w:pPr>
-        <w:tabs>
-          <w:tab w:val="right" w:pos="9360"/>
-        </w:tabs>
         <w:rPr>
           <w:rFonts w:ascii="Arial" w:hAnsi="Arial" w:cs="Arial"/>
           <w:b/>
@@ -30,17 +27,6 @@
         </w:rPr>
         <w:t>{{ full_name }}</w:t>
       </w:r>
-      <w:r>
-        <w:tab/>
-      </w:r>
-      <w:r>
-        <w:rPr>
-          <w:rFonts w:ascii="Arial" w:hAnsi="Arial"/>
-          <w:b/>
-          <w:sz w:val="20"/>
-        </w:rPr>
-        <w:t>{% if years_experience %}{{ years_experience }}+ YRS. OF EXP.{% endif %}</w:t>
-      </w:r>
     </w:p>
     <w:p>
       <w:pPr>
@@ -55,6 +41,7 @@
           <w:sz w:val="20"/>
           <w:szCs w:val="20"/>
         </w:rPr>
+        <w:spacing w:before="240" w:after="0"/>
       </w:pPr>
       <w:r>
         <w:rPr>
@@ -81,7 +68,7 @@
     </w:p>
     <w:p>
       <w:pPr>
-        <w:spacing w:after="0"/>
+        <w:spacing w:after="0" w:before="240"/>
       </w:pPr>
       <w:r>
         <w:rPr>
@@ -126,6 +113,7 @@
           <w:sz w:val="20"/>
           <w:szCs w:val="20"/>
         </w:rPr>
+        <w:spacing w:before="240" w:after="240"/>
       </w:pPr>
       <w:r>
         <w:rPr>
@@ -168,6 +156,7 @@
           <w:sz w:val="20"/>
           <w:szCs w:val="20"/>
         </w:rPr>
+        <w:spacing w:before="240" w:after="0"/>
       </w:pPr>
       <w:r>
         <w:rPr>
@@ -227,7 +216,7 @@
         <w:tabs>
           <w:tab w:pos="9360" w:val="right"/>
         </w:tabs>
-        <w:spacing w:after="0"/>
+        <w:spacing w:after="0" w:before="240"/>
         <w:ind w:left="0" w:firstLine="0"/>
         <w:keepNext/>
       </w:pPr>
@@ -252,6 +241,9 @@
     </w:p>
     <w:p>
       <w:pPr>
+        <w:tabs>
+          <w:tab w:val="right" w:pos="9360"/>
+        </w:tabs>
         <w:spacing w:after="0"/>
         <w:ind w:left="360" w:firstLine="0"/>
         <w:keepNext/>
@@ -277,14 +269,30 @@
     </w:p>
     <w:p>
       <w:pPr>
+        <w:tabs>
+          <w:tab w:val="left" w:pos="720"/>
+        </w:tabs>
         <w:spacing w:after="0"/>
-        <w:ind w:left="360" w:firstLine="0"/>
+        <w:ind w:left="720" w:hanging="360"/>
+        <w:jc w:val="both"/>
       </w:pPr>
       <w:r>
         <w:rPr>
           <w:b w:val="0"/>
         </w:rPr>
-        <w:t>- {{ b }}</w:t>
+        <w:t xml:space="preserve">-</w:t>
+      </w:r>
+      <w:r>
+        <w:rPr>
+          <w:b w:val="0"/>
+        </w:rPr>
+        <w:tab/>
+      </w:r>
+      <w:r>
+        <w:rPr>
+          <w:b w:val="0"/>
+        </w:rPr>
+        <w:t xml:space="preserve">{{ b }}</w:t>
       </w:r>
     </w:p>
     <w:p>
@@ -321,6 +329,18 @@
           <w:b w:val="0"/>
         </w:rPr>
         <w:t>{% endfor %}</w:t>
+      </w:r>
+    </w:p>
+    <w:p>
+      <w:pPr>
+        <w:pStyle w:val="CVControlTag"/>
+        <w:ind w:left="0" w:firstLine="0"/>
+      </w:pPr>
+      <w:r>
+        <w:rPr>
+          <w:b w:val="0"/>
+        </w:rPr>
+        <w:t>{% if certifications_items %}</w:t>
       </w:r>
     </w:p>
     <w:p>
@@ -335,6 +355,7 @@
           <w:sz w:val="20"/>
           <w:szCs w:val="20"/>
         </w:rPr>
+        <w:spacing w:before="240" w:after="240"/>
       </w:pPr>
       <w:r>
         <w:rPr>
@@ -371,14 +392,29 @@
     </w:p>
     <w:p>
       <w:pPr>
+        <w:tabs>
+          <w:tab w:val="left" w:pos="720"/>
+        </w:tabs>
         <w:spacing w:after="0"/>
-        <w:ind w:left="360" w:firstLine="0"/>
+        <w:ind w:left="720" w:hanging="360"/>
       </w:pPr>
       <w:r>
         <w:rPr>
           <w:b w:val="0"/>
         </w:rPr>
-        <w:t>- {{ item }}</w:t>
+        <w:t xml:space="preserve">-</w:t>
+      </w:r>
+      <w:r>
+        <w:rPr>
+          <w:b w:val="0"/>
+        </w:rPr>
+        <w:tab/>
+      </w:r>
+      <w:r>
+        <w:rPr>
+          <w:b w:val="0"/>
+        </w:rPr>
+        <w:t xml:space="preserve">{{ item }}</w:t>
       </w:r>
     </w:p>
     <w:p>
@@ -391,6 +427,30 @@
           <w:b w:val="0"/>
         </w:rPr>
         <w:t>{% endfor %}</w:t>
+      </w:r>
+    </w:p>
+    <w:p>
+      <w:pPr>
+        <w:pStyle w:val="CVControlTag"/>
+        <w:ind w:left="0" w:firstLine="0"/>
+      </w:pPr>
+      <w:r>
+        <w:rPr>
+          <w:b w:val="0"/>
+        </w:rPr>
+        <w:t>{% endif %}</w:t>
+      </w:r>
+    </w:p>
+    <w:p>
+      <w:pPr>
+        <w:pStyle w:val="CVControlTag"/>
+        <w:ind w:left="0" w:firstLine="0"/>
+      </w:pPr>
+      <w:r>
+        <w:rPr>
+          <w:b w:val="0"/>
+        </w:rPr>
+        <w:t>{% if skills_items %}</w:t>
       </w:r>
     </w:p>
     <w:p>
@@ -405,6 +465,7 @@
           <w:sz w:val="20"/>
           <w:szCs w:val="20"/>
         </w:rPr>
+        <w:spacing w:before="240" w:after="240"/>
       </w:pPr>
       <w:r>
         <w:rPr>
@@ -430,14 +491,29 @@
     </w:p>
     <w:p>
       <w:pPr>
+        <w:tabs>
+          <w:tab w:val="left" w:pos="720"/>
+        </w:tabs>
         <w:spacing w:after="0"/>
-        <w:ind w:left="360" w:firstLine="0"/>
+        <w:ind w:left="720" w:hanging="360"/>
       </w:pPr>
       <w:r>
         <w:rPr>
           <w:b w:val="0"/>
         </w:rPr>
-        <w:t>- {{ item }}</w:t>
+        <w:t xml:space="preserve">-</w:t>
+      </w:r>
+      <w:r>
+        <w:rPr>
+          <w:b w:val="0"/>
+        </w:rPr>
+        <w:tab/>
+      </w:r>
+      <w:r>
+        <w:rPr>
+          <w:b w:val="0"/>
+        </w:rPr>
+        <w:t xml:space="preserve">{{ item }}</w:t>
       </w:r>
     </w:p>
     <w:p>
@@ -450,6 +526,18 @@
           <w:b w:val="0"/>
         </w:rPr>
         <w:t>{% endfor %}</w:t>
+      </w:r>
+    </w:p>
+    <w:p>
+      <w:pPr>
+        <w:pStyle w:val="CVControlTag"/>
+        <w:ind w:left="0" w:firstLine="0"/>
+      </w:pPr>
+      <w:r>
+        <w:rPr>
+          <w:b w:val="0"/>
+        </w:rPr>
+        <w:t>{% endif %}</w:t>
       </w:r>
     </w:p>
     <w:sectPr>

</xml_diff>